<commit_message>
Sınıf Rehberlik: müdür imzası sağda, "OLUR" ve tarih eklendi
- Yazdırma: öğretmen imzaları solda, okul müdürü sağ kenarda; müdür bloğu OLUR / tarih / ad / unvan.
- Word şablonları (aylık, dönem sonu, yıl sonu) ve plan Excel'i aynı düzene getirildi; aylıkta üç imza tek satırda.
- Yıl sonu raporundaki ayrı tarih satırı kaldırıldı (tarih OLUR bloğunda).
- Sürüm pinleri ve CACHE_ADI güncellendi; test genişletildi.

Co-Authored-By: Claude Sonnet 5.5 <noreply@anthropic.com>
Claude-Session: https://claude.ai/code/session_019U6EDEi1WhH5i3rhsPfknR
</commit_message>
<xml_diff>
--- a/assets/rehberlik/aylik.docx
+++ b/assets/rehberlik/aylik.docx
@@ -2155,12 +2155,13 @@
     <w:tbl>
       <w:tblPr>
         <w:tblW w:w="10206" w:type="dxa"/>
-        <w:jc w:val="left"/>
+        <w:jc w:val="center"/>
         <w:tblLook w:val="04A0" w:firstRow="1" w:lastRow="0" w:firstColumn="1" w:lastColumn="0" w:noHBand="0" w:noVBand="1"/>
       </w:tblPr>
       <w:tblGrid>
-        <w:gridCol w:w="5103"/>
-        <w:gridCol w:w="5103"/>
+        <w:gridCol w:w="3402"/>
+        <w:gridCol w:w="3402"/>
+        <w:gridCol w:w="3402"/>
       </w:tblGrid>
       <w:tr>
         <w:trPr>
@@ -2168,7 +2169,8 @@
         </w:trPr>
         <w:tc>
           <w:tcPr>
-            <w:tcW w:w="5103" w:type="dxa"/>
+            <w:tcW w:w="3402" w:type="dxa"/>
+            <w:vAlign w:val="bottom"/>
           </w:tcPr>
           <w:p>
             <w:pPr>
@@ -2215,7 +2217,8 @@
         </w:tc>
         <w:tc>
           <w:tcPr>
-            <w:tcW w:w="5103" w:type="dxa"/>
+            <w:tcW w:w="3402" w:type="dxa"/>
+            <w:vAlign w:val="bottom"/>
           </w:tcPr>
           <w:p>
             <w:pPr>
@@ -2248,6 +2251,75 @@
                 <w:szCs w:val="20"/>
               </w:rPr>
               <w:t>………………………………..</w:t>
+            </w:r>
+          </w:p>
+        </w:tc>
+        <w:tc>
+          <w:tcPr>
+            <w:tcW w:w="3402" w:type="dxa"/>
+            <w:vAlign w:val="bottom"/>
+          </w:tcPr>
+          <w:p>
+            <w:pPr>
+              <w:keepNext/>
+              <w:jc w:val="left"/>
+              <w:rPr>
+                <w:rFonts w:asciiTheme="majorHAnsi" w:hAnsiTheme="majorHAnsi"/>
+                <w:b/>
+                <w:sz w:val="20"/>
+                <w:szCs w:val="20"/>
+              </w:rPr>
+            </w:pPr>
+            <w:r>
+              <w:rPr>
+                <w:rFonts w:asciiTheme="majorHAnsi" w:hAnsiTheme="majorHAnsi"/>
+                <w:b/>
+                <w:sz w:val="20"/>
+                <w:szCs w:val="20"/>
+              </w:rPr>
+              <w:t xml:space="preserve">OLUR</w:t>
+            </w:r>
+          </w:p>
+          <w:p>
+            <w:pPr>
+              <w:keepNext/>
+              <w:jc w:val="left"/>
+              <w:rPr>
+                <w:rFonts w:asciiTheme="majorHAnsi" w:hAnsiTheme="majorHAnsi"/>
+                <w:b/>
+                <w:sz w:val="20"/>
+                <w:szCs w:val="20"/>
+              </w:rPr>
+            </w:pPr>
+            <w:r>
+              <w:rPr>
+                <w:rFonts w:asciiTheme="majorHAnsi" w:hAnsiTheme="majorHAnsi"/>
+                <w:b/>
+                <w:sz w:val="20"/>
+                <w:szCs w:val="20"/>
+              </w:rPr>
+              <w:t xml:space="preserve">{{TARIH}}</w:t>
+            </w:r>
+          </w:p>
+          <w:p>
+            <w:pPr>
+              <w:keepNext/>
+              <w:jc w:val="left"/>
+              <w:rPr>
+                <w:rFonts w:asciiTheme="majorHAnsi" w:hAnsiTheme="majorHAnsi"/>
+                <w:b/>
+                <w:sz w:val="20"/>
+                <w:szCs w:val="20"/>
+              </w:rPr>
+            </w:pPr>
+            <w:r>
+              <w:rPr>
+                <w:rFonts w:asciiTheme="majorHAnsi" w:hAnsiTheme="majorHAnsi"/>
+                <w:b/>
+                <w:sz w:val="20"/>
+                <w:szCs w:val="20"/>
+              </w:rPr>
+              <w:t xml:space="preserve">{{MUDUR}}</w:t>
             </w:r>
           </w:p>
         </w:tc>
@@ -2258,7 +2330,7 @@
         </w:trPr>
         <w:tc>
           <w:tcPr>
-            <w:tcW w:w="5103" w:type="dxa"/>
+            <w:tcW w:w="3402" w:type="dxa"/>
           </w:tcPr>
           <w:p>
             <w:pPr>
@@ -2284,7 +2356,7 @@
         </w:tc>
         <w:tc>
           <w:tcPr>
-            <w:tcW w:w="5103" w:type="dxa"/>
+            <w:tcW w:w="3402" w:type="dxa"/>
           </w:tcPr>
           <w:p>
             <w:pPr>
@@ -2308,36 +2380,9 @@
             </w:r>
           </w:p>
         </w:tc>
-      </w:tr>
-    </w:tbl>
-    <w:p>
-      <w:pPr>
-        <w:keepNext/>
-        <w:ind w:left="2832" w:firstLine="708"/>
-        <w:rPr>
-          <w:rFonts w:asciiTheme="majorHAnsi" w:hAnsiTheme="majorHAnsi"/>
-          <w:b/>
-          <w:sz w:val="44"/>
-        </w:rPr>
-      </w:pPr>
-    </w:p>
-    <w:tbl>
-      <w:tblPr>
-        <w:tblW w:w="3924" w:type="dxa"/>
-        <w:jc w:val="left"/>
-        <w:tblLook w:val="04A0" w:firstRow="1" w:lastRow="0" w:firstColumn="1" w:lastColumn="0" w:noHBand="0" w:noVBand="1"/>
-      </w:tblPr>
-      <w:tblGrid>
-        <w:gridCol w:w="3924"/>
-      </w:tblGrid>
-      <w:tr>
-        <w:trPr>
-          <w:trHeight w:val="278"/>
-          <w:jc w:val="center"/>
-        </w:trPr>
-        <w:tc>
-          <w:tcPr>
-            <w:tcW w:w="3924" w:type="dxa"/>
+        <w:tc>
+          <w:tcPr>
+            <w:tcW w:w="3402" w:type="dxa"/>
           </w:tcPr>
           <w:p>
             <w:pPr>
@@ -2347,6 +2392,7 @@
                 <w:rFonts w:asciiTheme="majorHAnsi" w:hAnsiTheme="majorHAnsi"/>
                 <w:b/>
                 <w:sz w:val="20"/>
+                <w:szCs w:val="20"/>
               </w:rPr>
             </w:pPr>
             <w:r>
@@ -2354,37 +2400,9 @@
                 <w:rFonts w:asciiTheme="majorHAnsi" w:hAnsiTheme="majorHAnsi"/>
                 <w:b/>
                 <w:sz w:val="20"/>
-              </w:rPr>
-              <w:t xml:space="preserve">{{MUDUR}}</w:t>
-            </w:r>
-          </w:p>
-        </w:tc>
-      </w:tr>
-      <w:tr>
-        <w:trPr>
-          <w:trHeight w:val="295"/>
-          <w:jc w:val="center"/>
-        </w:trPr>
-        <w:tc>
-          <w:tcPr>
-            <w:tcW w:w="3924" w:type="dxa"/>
-          </w:tcPr>
-          <w:p>
-            <w:pPr>
-              <w:jc w:val="left"/>
-              <w:rPr>
-                <w:rFonts w:asciiTheme="majorHAnsi" w:hAnsiTheme="majorHAnsi"/>
-                <w:b/>
-                <w:sz w:val="20"/>
-              </w:rPr>
-            </w:pPr>
-            <w:r>
-              <w:rPr>
-                <w:rFonts w:asciiTheme="majorHAnsi" w:hAnsiTheme="majorHAnsi"/>
-                <w:b/>
-                <w:sz w:val="20"/>
-              </w:rPr>
-              <w:t>Okul Müdürü</w:t>
+                <w:szCs w:val="20"/>
+              </w:rPr>
+              <w:t xml:space="preserve">Okul Müdürü</w:t>
             </w:r>
           </w:p>
         </w:tc>

</xml_diff>